<commit_message>
Startup integrity guard, Riyadh metro-feature fix, v22 doc refresh
- /health now runs a boot-time integrity check (hub files + POI/district
  lookups) and reports status "degraded" instead of serving silently
  degraded predictions.
- Fix Riyadh v10/v11 feature injection reading district_ar from a dict
  that never contains it — metro + type-stratified lag features were
  falling back to defaults for every request. Regression pins re-pinned.
- Refresh stale NYC v11 metrics to v22 across generate_docx.py, paper,
  technical report, demo script; rewrite PROJECT_STATUS.md; regenerate
  all .docx files.
</commit_message>
<xml_diff>
--- a/docs/demo_script.docx
+++ b/docs/demo_script.docx
@@ -724,7 +724,7 @@
           </w:tcPr>
           <w:p>
             <w:r>
-              <w:t>104</w:t>
+              <w:t>134</w:t>
             </w:r>
           </w:p>
         </w:tc>
@@ -788,7 +788,7 @@
           </w:tcPr>
           <w:p>
             <w:r>
-              <w:t>0.6450</w:t>
+              <w:t>0.6495</w:t>
             </w:r>
           </w:p>
         </w:tc>
@@ -798,7 +798,7 @@
           </w:tcPr>
           <w:p>
             <w:r>
-              <w:t>Stack v11</w:t>
+              <w:t>Stack v22</w:t>
             </w:r>
           </w:p>
         </w:tc>
@@ -830,7 +830,7 @@
           </w:tcPr>
           <w:p>
             <w:r>
-              <w:t>Stack v11</w:t>
+              <w:t>Stack v22</w:t>
             </w:r>
           </w:p>
         </w:tc>

</xml_diff>

<commit_message>
Refresh v11-era borough/tier tables to v22 canonical; regenerate scatter data
</commit_message>
<xml_diff>
--- a/docs/demo_script.docx
+++ b/docs/demo_script.docx
@@ -462,10 +462,10 @@
         <w:t>"The analytics dashboard shows model performance broken down by NYC borough and price tier."</w:t>
         <w:br/>
         <w:br/>
-        <w:t>"Notice the Staten Island paradox: lowest R²=0.41 but best MedAPE=13.5%. Staten Island has very low price variance; the model's absolute errors are small, but R² penalises a low-variance target. MedAPE is the right metric for a user-facing AVM."</w:t>
+        <w:t>"Notice the Staten Island paradox: the worst per-borough R² but the best MedAPE (14.4%). Staten Island has very low price variance; the model's absolute errors are small, but R² penalises a low-variance target. MedAPE is the right metric for a user-facing AVM."</w:t>
         <w:br/>
         <w:br/>
-        <w:t>"Manhattan is hardest at 36.7% MedAPE. Co-op board approval discounts and unobservable interior finishes create heterogeneity that no tabular dataset can capture."</w:t>
+        <w:t>"Manhattan is hardest at 35.2% MedAPE. Co-op board approval discounts and unobservable interior finishes create heterogeneity that no tabular dataset can capture."</w:t>
       </w:r>
     </w:p>
     <w:p>

</xml_diff>

<commit_message>
Demo dry-run fixes: match narration to live model behaviour
</commit_message>
<xml_diff>
--- a/docs/demo_script.docx
+++ b/docs/demo_script.docx
@@ -208,7 +208,10 @@
         <w:t>[Submit prediction — pause for result to load]</w:t>
         <w:br/>
         <w:br/>
-        <w:t>"THAMAN returns a predicted price, a confidence band, a letter grade, and the top features driving this estimate. Building class and neighbourhood encoding are the top two features — consistent with NYC real estate: where you are and what type of building matter more than size alone."</w:t>
+        <w:t>"THAMAN returns a predicted price, a confidence band, a letter grade, and the top features driving this estimate. For this condo, neighbourhood encoding, renovation age, and unit count are among the top drivers — consistent with NYC real estate: where you are matters more than size alone."</w:t>
+        <w:br/>
+        <w:br/>
+        <w:t>"Notice the grade is a C with a ±35% band — Manhattan is the hardest segment in the data, and the system reports that honestly. Confidence is segment-adaptive: Staten Island would show ±14%."</w:t>
         <w:br/>
         <w:br/>
         <w:t>"The comparable sales bubbles show the nearest actual recorded sales — green means our estimate is close, red means we're further off. These are real deed-recorded transactions from 185,000 NYC sales, 2022 to 2026."</w:t>
@@ -337,7 +340,7 @@
         <w:t>[Submit prediction — wait for result]</w:t>
         <w:br/>
         <w:br/>
-        <w:t>"The model returns a prediction in SAR per square metre. The SHAP breakdown: metro access, commercial density, air quality, and district price history are the top drivers."</w:t>
+        <w:t>"The model returns a prediction in SAR per square metre. The SHAP breakdown: district price history, the district-type encoding, and the Bayut asking-price signal are the top drivers — and the spatial grid shows this location sits about 575 metres from a metro station."</w:t>
         <w:br/>
         <w:br/>
         <w:t>"The Riyadh Metro opened in 2024 — a novel infrastructure signal the model captures, entirely absent from pre-2024 models."</w:t>
@@ -517,7 +520,7 @@
     </w:p>
     <w:p>
       <w:r>
-        <w:t>"To summarise: THAMAN is a production-deployed AVM across two cities — New York and Riyadh — using a four-model stacking ensemble across 104 and 76 features respectively. It achieves competitive accuracy on NYC's 185,000-sale holdout and demonstrates cross-market generalisability on Saudi Arabia's data-scarce district-aggregate market. The full system — data pipelines, training code, API, and web interface — is deployed on Hugging Face and open-sourced on GitHub. Thank you."</w:t>
+        <w:t>"To summarise: THAMAN is a production-deployed AVM across two cities — New York and Riyadh — using a four-model stacking ensemble across 134 and 149 features respectively. It achieves competitive accuracy on 27,763 held-out NYC sales and demonstrates cross-market generalisability on Saudi Arabia's data-scarce district-aggregate market. The full system — data pipelines, training code, API, and web interface — is deployed on Hugging Face and open-sourced on GitHub. Thank you."</w:t>
       </w:r>
     </w:p>
     <w:p>
@@ -573,7 +576,7 @@
       <w:r>
         <w:t>If HF completely unavailable: open Terminal and run:</w:t>
         <w:br/>
-        <w:t xml:space="preserve">    cd /Users/totam/Desktop/new_try &amp;&amp; uvicorn api.main:app --port 8000</w:t>
+        <w:t xml:space="preserve">    cd /Users/totam/Desktop/THAMAN/new_try &amp;&amp; uvicorn api.main:app --port 8000</w:t>
         <w:br/>
         <w:t xml:space="preserve">    Then open: http://localhost:8000/ui</w:t>
       </w:r>
@@ -1268,7 +1271,7 @@
           </w:tcPr>
           <w:p>
             <w:r>
-              <w:t>37</w:t>
+              <w:t>109</w:t>
             </w:r>
           </w:p>
         </w:tc>
@@ -1278,7 +1281,7 @@
           </w:tcPr>
           <w:p>
             <w:r>
-              <w:t>15 scorer + 22 API tests</w:t>
+              <w:t>api, scorer, parity, SHAP, pins, golden, distribution, load</w:t>
             </w:r>
           </w:p>
         </w:tc>

</xml_diff>

<commit_message>
Correct API latency claims: 200-400ms is local, live Space is ~0.7-1.2s
</commit_message>
<xml_diff>
--- a/docs/demo_script.docx
+++ b/docs/demo_script.docx
@@ -1239,7 +1239,7 @@
           </w:tcPr>
           <w:p>
             <w:r>
-              <w:t>200–400 ms</w:t>
+              <w:t>200–400 ms local · ~1 s live</w:t>
             </w:r>
           </w:p>
         </w:tc>
@@ -1249,7 +1249,7 @@
           </w:tcPr>
           <w:p>
             <w:r>
-              <w:t>Including SHAP computation</w:t>
+              <w:t>Incl. SHAP; live adds free-tier CPU + network</w:t>
             </w:r>
           </w:p>
         </w:tc>

</xml_diff>